<commit_message>
feat: Add system check, fix rounding, improve PyInstaller support
Major improvements to the application:
- Add system_check module for compatibility verification at startup
- Fix mathematical rounding (11.45 → 11.5, not banker's rounding)
- Add new Jinja2 filters: |czek (mandatory decimal), |nondecimal (integers only)
- Move measurement duration from Company to individual workers (A/B)
- Add automatic average calculation between workers
- Fix PyInstaller resource paths (_internal directory)
- Improve category highlighting colors (brighter green, consistent orange/red)
- Add font formatting to category cells (36pt Cambria)

🤖 Generated with [Claude Code](https://claude.com/claude-code)

Co-Authored-By: Claude <noreply@anthropic.com>
</commit_message>
<xml_diff>
--- a/sample_protocols/Autorizované protokoly pro MUŽE/PP_XX_Firma_Pozice_females.docx
+++ b/sample_protocols/Autorizované protokoly pro MUŽE/PP_XX_Firma_Pozice_females.docx
@@ -311,10 +311,11 @@
           <w:szCs w:val="28"/>
           <w:lang w:eastAsia="cs-CZ"/>
         </w:rPr>
-        <w:t xml:space="preserve"> {{section2_</w:t>
-      </w:r>
-      <w:proofErr w:type="gramStart"/>
-      <w:r>
+        <w:t xml:space="preserve"> {{section2_firma.evidence_number}}/2025</w:t>
+      </w:r>
+    </w:p>
+    <w:p>
+      <w:pPr>
         <w:rPr>
           <w:rFonts w:asciiTheme="majorHAnsi" w:eastAsia="Times New Roman" w:hAnsiTheme="majorHAnsi" w:cs="Arial"/>
           <w:b/>
@@ -323,10 +324,10 @@
           <w:szCs w:val="28"/>
           <w:lang w:eastAsia="cs-CZ"/>
         </w:rPr>
-        <w:t>firma.evidence</w:t>
-      </w:r>
-      <w:proofErr w:type="gramEnd"/>
-      <w:r>
+      </w:pPr>
+    </w:p>
+    <w:p>
+      <w:pPr>
         <w:rPr>
           <w:rFonts w:asciiTheme="majorHAnsi" w:eastAsia="Times New Roman" w:hAnsiTheme="majorHAnsi" w:cs="Arial"/>
           <w:b/>
@@ -335,55 +336,6 @@
           <w:szCs w:val="28"/>
           <w:lang w:eastAsia="cs-CZ"/>
         </w:rPr>
-        <w:t>_number</w:t>
-      </w:r>
-      <w:proofErr w:type="gramStart"/>
-      <w:r>
-        <w:rPr>
-          <w:rFonts w:asciiTheme="majorHAnsi" w:eastAsia="Times New Roman" w:hAnsiTheme="majorHAnsi" w:cs="Arial"/>
-          <w:b/>
-          <w:bCs/>
-          <w:sz w:val="28"/>
-          <w:szCs w:val="28"/>
-          <w:lang w:eastAsia="cs-CZ"/>
-        </w:rPr>
-        <w:t>}}/</w:t>
-      </w:r>
-      <w:proofErr w:type="gramEnd"/>
-      <w:r>
-        <w:rPr>
-          <w:rFonts w:asciiTheme="majorHAnsi" w:eastAsia="Times New Roman" w:hAnsiTheme="majorHAnsi" w:cs="Arial"/>
-          <w:b/>
-          <w:bCs/>
-          <w:sz w:val="28"/>
-          <w:szCs w:val="28"/>
-          <w:lang w:eastAsia="cs-CZ"/>
-        </w:rPr>
-        <w:t>2025</w:t>
-      </w:r>
-    </w:p>
-    <w:p>
-      <w:pPr>
-        <w:rPr>
-          <w:rFonts w:asciiTheme="majorHAnsi" w:eastAsia="Times New Roman" w:hAnsiTheme="majorHAnsi" w:cs="Arial"/>
-          <w:b/>
-          <w:bCs/>
-          <w:sz w:val="28"/>
-          <w:szCs w:val="28"/>
-          <w:lang w:eastAsia="cs-CZ"/>
-        </w:rPr>
-      </w:pPr>
-    </w:p>
-    <w:p>
-      <w:pPr>
-        <w:rPr>
-          <w:rFonts w:asciiTheme="majorHAnsi" w:eastAsia="Times New Roman" w:hAnsiTheme="majorHAnsi" w:cs="Arial"/>
-          <w:b/>
-          <w:bCs/>
-          <w:sz w:val="28"/>
-          <w:szCs w:val="28"/>
-          <w:lang w:eastAsia="cs-CZ"/>
-        </w:rPr>
       </w:pPr>
     </w:p>
     <w:p>
@@ -423,10 +375,12 @@
           <w:szCs w:val="23"/>
           <w:lang w:eastAsia="cs-CZ"/>
         </w:rPr>
-        <w:t>{{section2_</w:t>
-      </w:r>
-      <w:proofErr w:type="gramStart"/>
-      <w:r>
+        <w:t>{{section2_firma.company}}</w:t>
+      </w:r>
+    </w:p>
+    <w:p>
+      <w:pPr>
+        <w:ind w:left="3540"/>
         <w:rPr>
           <w:rFonts w:ascii="Cambria" w:eastAsia="Times New Roman" w:hAnsi="Cambria" w:cs="Arial CE"/>
           <w:b/>
@@ -434,9 +388,7 @@
           <w:szCs w:val="23"/>
           <w:lang w:eastAsia="cs-CZ"/>
         </w:rPr>
-        <w:t>firma.company</w:t>
-      </w:r>
-      <w:proofErr w:type="gramEnd"/>
+      </w:pPr>
       <w:r>
         <w:rPr>
           <w:rFonts w:ascii="Cambria" w:eastAsia="Times New Roman" w:hAnsi="Cambria" w:cs="Arial CE"/>
@@ -445,161 +397,29 @@
           <w:szCs w:val="23"/>
           <w:lang w:eastAsia="cs-CZ"/>
         </w:rPr>
-        <w:t>}}</w:t>
+        <w:t>{{section2_firma.address}} {{section2_firma.house_number}}</w:t>
       </w:r>
     </w:p>
     <w:p>
       <w:pPr>
         <w:ind w:left="3540"/>
         <w:rPr>
+          <w:rFonts w:asciiTheme="majorHAnsi" w:hAnsiTheme="majorHAnsi"/>
+          <w:b/>
+          <w:sz w:val="24"/>
+          <w:szCs w:val="24"/>
+          <w:lang w:eastAsia="cs-CZ"/>
+        </w:rPr>
+      </w:pPr>
+      <w:r>
+        <w:rPr>
           <w:rFonts w:ascii="Cambria" w:eastAsia="Times New Roman" w:hAnsi="Cambria" w:cs="Arial CE"/>
           <w:b/>
           <w:sz w:val="24"/>
           <w:szCs w:val="23"/>
           <w:lang w:eastAsia="cs-CZ"/>
         </w:rPr>
-      </w:pPr>
-      <w:r>
-        <w:rPr>
-          <w:rFonts w:ascii="Cambria" w:eastAsia="Times New Roman" w:hAnsi="Cambria" w:cs="Arial CE"/>
-          <w:b/>
-          <w:sz w:val="24"/>
-          <w:szCs w:val="23"/>
-          <w:lang w:eastAsia="cs-CZ"/>
-        </w:rPr>
-        <w:t>{{section2_</w:t>
-      </w:r>
-      <w:proofErr w:type="gramStart"/>
-      <w:r>
-        <w:rPr>
-          <w:rFonts w:ascii="Cambria" w:eastAsia="Times New Roman" w:hAnsi="Cambria" w:cs="Arial CE"/>
-          <w:b/>
-          <w:sz w:val="24"/>
-          <w:szCs w:val="23"/>
-          <w:lang w:eastAsia="cs-CZ"/>
-        </w:rPr>
-        <w:t>firma.address</w:t>
-      </w:r>
-      <w:proofErr w:type="gramEnd"/>
-      <w:r>
-        <w:rPr>
-          <w:rFonts w:ascii="Cambria" w:eastAsia="Times New Roman" w:hAnsi="Cambria" w:cs="Arial CE"/>
-          <w:b/>
-          <w:sz w:val="24"/>
-          <w:szCs w:val="23"/>
-          <w:lang w:eastAsia="cs-CZ"/>
-        </w:rPr>
-        <w:t>}} {{section2_</w:t>
-      </w:r>
-      <w:proofErr w:type="gramStart"/>
-      <w:r>
-        <w:rPr>
-          <w:rFonts w:ascii="Cambria" w:eastAsia="Times New Roman" w:hAnsi="Cambria" w:cs="Arial CE"/>
-          <w:b/>
-          <w:sz w:val="24"/>
-          <w:szCs w:val="23"/>
-          <w:lang w:eastAsia="cs-CZ"/>
-        </w:rPr>
-        <w:t>firma.house</w:t>
-      </w:r>
-      <w:proofErr w:type="gramEnd"/>
-      <w:r>
-        <w:rPr>
-          <w:rFonts w:ascii="Cambria" w:eastAsia="Times New Roman" w:hAnsi="Cambria" w:cs="Arial CE"/>
-          <w:b/>
-          <w:sz w:val="24"/>
-          <w:szCs w:val="23"/>
-          <w:lang w:eastAsia="cs-CZ"/>
-        </w:rPr>
-        <w:t>_number}}</w:t>
-      </w:r>
-    </w:p>
-    <w:p>
-      <w:pPr>
-        <w:ind w:left="3540"/>
-        <w:rPr>
-          <w:rFonts w:asciiTheme="majorHAnsi" w:hAnsiTheme="majorHAnsi"/>
-          <w:b/>
-          <w:sz w:val="24"/>
-          <w:szCs w:val="24"/>
-          <w:lang w:eastAsia="cs-CZ"/>
-        </w:rPr>
-      </w:pPr>
-      <w:r>
-        <w:rPr>
-          <w:rFonts w:ascii="Cambria" w:eastAsia="Times New Roman" w:hAnsi="Cambria" w:cs="Arial CE"/>
-          <w:b/>
-          <w:sz w:val="24"/>
-          <w:szCs w:val="23"/>
-          <w:lang w:eastAsia="cs-CZ"/>
-        </w:rPr>
-        <w:t>{{section2_</w:t>
-      </w:r>
-      <w:proofErr w:type="gramStart"/>
-      <w:r>
-        <w:rPr>
-          <w:rFonts w:ascii="Cambria" w:eastAsia="Times New Roman" w:hAnsi="Cambria" w:cs="Arial CE"/>
-          <w:b/>
-          <w:sz w:val="24"/>
-          <w:szCs w:val="23"/>
-          <w:lang w:eastAsia="cs-CZ"/>
-        </w:rPr>
-        <w:t>firma.city</w:t>
-      </w:r>
-      <w:proofErr w:type="gramEnd"/>
-      <w:r>
-        <w:rPr>
-          <w:rFonts w:ascii="Cambria" w:eastAsia="Times New Roman" w:hAnsi="Cambria" w:cs="Arial CE"/>
-          <w:b/>
-          <w:sz w:val="24"/>
-          <w:szCs w:val="23"/>
-          <w:lang w:eastAsia="cs-CZ"/>
-        </w:rPr>
-        <w:t>}} {{section2_</w:t>
-      </w:r>
-      <w:proofErr w:type="gramStart"/>
-      <w:r>
-        <w:rPr>
-          <w:rFonts w:ascii="Cambria" w:eastAsia="Times New Roman" w:hAnsi="Cambria" w:cs="Arial CE"/>
-          <w:b/>
-          <w:sz w:val="24"/>
-          <w:szCs w:val="23"/>
-          <w:lang w:eastAsia="cs-CZ"/>
-        </w:rPr>
-        <w:t>firma.city</w:t>
-      </w:r>
-      <w:proofErr w:type="gramEnd"/>
-      <w:r>
-        <w:rPr>
-          <w:rFonts w:ascii="Cambria" w:eastAsia="Times New Roman" w:hAnsi="Cambria" w:cs="Arial CE"/>
-          <w:b/>
-          <w:sz w:val="24"/>
-          <w:szCs w:val="23"/>
-          <w:lang w:eastAsia="cs-CZ"/>
-        </w:rPr>
-        <w:t>_district}} {{section2_</w:t>
-      </w:r>
-      <w:proofErr w:type="gramStart"/>
-      <w:r>
-        <w:rPr>
-          <w:rFonts w:ascii="Cambria" w:eastAsia="Times New Roman" w:hAnsi="Cambria" w:cs="Arial CE"/>
-          <w:b/>
-          <w:sz w:val="24"/>
-          <w:szCs w:val="23"/>
-          <w:lang w:eastAsia="cs-CZ"/>
-        </w:rPr>
-        <w:t>firma.postal</w:t>
-      </w:r>
-      <w:proofErr w:type="gramEnd"/>
-      <w:r>
-        <w:rPr>
-          <w:rFonts w:ascii="Cambria" w:eastAsia="Times New Roman" w:hAnsi="Cambria" w:cs="Arial CE"/>
-          <w:b/>
-          <w:sz w:val="24"/>
-          <w:szCs w:val="23"/>
-          <w:lang w:eastAsia="cs-CZ"/>
-        </w:rPr>
-        <w:t>_code}}</w:t>
+        <w:t>{{section2_firma.city}} {{section2_firma.city_district}} {{section2_firma.postal_code}}</w:t>
       </w:r>
     </w:p>
     <w:p>
@@ -758,9 +578,8 @@
           <w:szCs w:val="24"/>
           <w:lang w:eastAsia="cs-CZ"/>
         </w:rPr>
-        <w:t>{{section2_</w:t>
-      </w:r>
-      <w:proofErr w:type="gramStart"/>
+        <w:t>{{section2_firma.profession_name}}</w:t>
+      </w:r>
       <w:r>
         <w:rPr>
           <w:rFonts w:ascii="Cambria" w:eastAsia="Times New Roman" w:hAnsi="Cambria" w:cs="Arial CE"/>
@@ -769,10 +588,11 @@
           <w:szCs w:val="24"/>
           <w:lang w:eastAsia="cs-CZ"/>
         </w:rPr>
-        <w:t>firma.profession</w:t>
-      </w:r>
-      <w:proofErr w:type="gramEnd"/>
-      <w:r>
+        <w:t xml:space="preserve"> - ženy</w:t>
+      </w:r>
+    </w:p>
+    <w:p>
+      <w:pPr>
         <w:rPr>
           <w:rFonts w:ascii="Cambria" w:eastAsia="Times New Roman" w:hAnsi="Cambria" w:cs="Arial CE"/>
           <w:b/>
@@ -780,11 +600,35 @@
           <w:szCs w:val="24"/>
           <w:lang w:eastAsia="cs-CZ"/>
         </w:rPr>
-        <w:t>_name}}</w:t>
-      </w:r>
-    </w:p>
-    <w:p>
-      <w:pPr>
+      </w:pPr>
+      <w:r>
+        <w:rPr>
+          <w:rFonts w:asciiTheme="majorHAnsi" w:hAnsiTheme="majorHAnsi"/>
+          <w:sz w:val="24"/>
+          <w:szCs w:val="24"/>
+          <w:lang w:eastAsia="cs-CZ"/>
+        </w:rPr>
+        <w:t>Pracoviště:</w:t>
+      </w:r>
+      <w:r>
+        <w:rPr>
+          <w:rFonts w:asciiTheme="majorHAnsi" w:hAnsiTheme="majorHAnsi"/>
+          <w:sz w:val="24"/>
+          <w:szCs w:val="24"/>
+          <w:lang w:eastAsia="cs-CZ"/>
+        </w:rPr>
+        <w:tab/>
+      </w:r>
+      <w:r>
+        <w:rPr>
+          <w:rFonts w:asciiTheme="majorHAnsi" w:hAnsiTheme="majorHAnsi"/>
+          <w:sz w:val="24"/>
+          <w:szCs w:val="24"/>
+          <w:lang w:eastAsia="cs-CZ"/>
+        </w:rPr>
+        <w:tab/>
+      </w:r>
+      <w:r>
         <w:rPr>
           <w:rFonts w:ascii="Cambria" w:eastAsia="Times New Roman" w:hAnsi="Cambria" w:cs="Arial CE"/>
           <w:b/>
@@ -792,65 +636,7 @@
           <w:szCs w:val="24"/>
           <w:lang w:eastAsia="cs-CZ"/>
         </w:rPr>
-      </w:pPr>
-      <w:r>
-        <w:rPr>
-          <w:rFonts w:asciiTheme="majorHAnsi" w:hAnsiTheme="majorHAnsi"/>
-          <w:sz w:val="24"/>
-          <w:szCs w:val="24"/>
-          <w:lang w:eastAsia="cs-CZ"/>
-        </w:rPr>
-        <w:t>Pracoviště:</w:t>
-      </w:r>
-      <w:r>
-        <w:rPr>
-          <w:rFonts w:asciiTheme="majorHAnsi" w:hAnsiTheme="majorHAnsi"/>
-          <w:sz w:val="24"/>
-          <w:szCs w:val="24"/>
-          <w:lang w:eastAsia="cs-CZ"/>
-        </w:rPr>
-        <w:tab/>
-      </w:r>
-      <w:r>
-        <w:rPr>
-          <w:rFonts w:asciiTheme="majorHAnsi" w:hAnsiTheme="majorHAnsi"/>
-          <w:sz w:val="24"/>
-          <w:szCs w:val="24"/>
-          <w:lang w:eastAsia="cs-CZ"/>
-        </w:rPr>
-        <w:tab/>
-      </w:r>
-      <w:r>
-        <w:rPr>
-          <w:rFonts w:ascii="Cambria" w:eastAsia="Times New Roman" w:hAnsi="Cambria" w:cs="Arial CE"/>
-          <w:b/>
-          <w:sz w:val="24"/>
-          <w:szCs w:val="24"/>
-          <w:lang w:eastAsia="cs-CZ"/>
-        </w:rPr>
-        <w:t>{{section2_</w:t>
-      </w:r>
-      <w:proofErr w:type="gramStart"/>
-      <w:r>
-        <w:rPr>
-          <w:rFonts w:ascii="Cambria" w:eastAsia="Times New Roman" w:hAnsi="Cambria" w:cs="Arial CE"/>
-          <w:b/>
-          <w:sz w:val="24"/>
-          <w:szCs w:val="24"/>
-          <w:lang w:eastAsia="cs-CZ"/>
-        </w:rPr>
-        <w:t>firma.workplace</w:t>
-      </w:r>
-      <w:proofErr w:type="gramEnd"/>
-      <w:r>
-        <w:rPr>
-          <w:rFonts w:ascii="Cambria" w:eastAsia="Times New Roman" w:hAnsi="Cambria" w:cs="Arial CE"/>
-          <w:b/>
-          <w:sz w:val="24"/>
-          <w:szCs w:val="24"/>
-          <w:lang w:eastAsia="cs-CZ"/>
-        </w:rPr>
-        <w:t>}}</w:t>
+        <w:t>{{section2_firma.workplace}}</w:t>
       </w:r>
     </w:p>
     <w:p>
@@ -1111,43 +897,7 @@
           <w:szCs w:val="20"/>
           <w:lang w:eastAsia="cs-CZ"/>
         </w:rPr>
-        <w:t>LSZ {{section2_</w:t>
-      </w:r>
-      <w:proofErr w:type="gramStart"/>
-      <w:r>
-        <w:rPr>
-          <w:sz w:val="20"/>
-          <w:szCs w:val="20"/>
-          <w:lang w:eastAsia="cs-CZ"/>
-        </w:rPr>
-        <w:t>firma.evidence</w:t>
-      </w:r>
-      <w:proofErr w:type="gramEnd"/>
-      <w:r>
-        <w:rPr>
-          <w:sz w:val="20"/>
-          <w:szCs w:val="20"/>
-          <w:lang w:eastAsia="cs-CZ"/>
-        </w:rPr>
-        <w:t>_number</w:t>
-      </w:r>
-      <w:proofErr w:type="gramStart"/>
-      <w:r>
-        <w:rPr>
-          <w:sz w:val="20"/>
-          <w:szCs w:val="20"/>
-          <w:lang w:eastAsia="cs-CZ"/>
-        </w:rPr>
-        <w:t>}}/</w:t>
-      </w:r>
-      <w:proofErr w:type="gramEnd"/>
-      <w:r>
-        <w:rPr>
-          <w:sz w:val="20"/>
-          <w:szCs w:val="20"/>
-          <w:lang w:eastAsia="cs-CZ"/>
-        </w:rPr>
-        <w:t>2025</w:t>
+        <w:t>LSZ {{section2_firma.evidence_number}}/2025</w:t>
       </w:r>
     </w:p>
     <w:p>
@@ -1344,21 +1094,7 @@
         <w:rPr>
           <w:lang w:eastAsia="cs-CZ"/>
         </w:rPr>
-        <w:t>section_generated_</w:t>
-      </w:r>
-      <w:proofErr w:type="gramStart"/>
-      <w:r>
-        <w:rPr>
-          <w:lang w:eastAsia="cs-CZ"/>
-        </w:rPr>
-        <w:t>texts.prvni</w:t>
-      </w:r>
-      <w:proofErr w:type="gramEnd"/>
-      <w:r>
-        <w:rPr>
-          <w:lang w:eastAsia="cs-CZ"/>
-        </w:rPr>
-        <w:t>_text_podminka_pocetdni</w:t>
+        <w:t>section_generated_texts.prvni_text_podminka_pocetdni</w:t>
       </w:r>
       <w:r>
         <w:rPr>
@@ -1849,35 +1585,7 @@
         <w:rPr>
           <w:lang w:eastAsia="cs-CZ"/>
         </w:rPr>
-        <w:t>{{section4_worker_</w:t>
-      </w:r>
-      <w:proofErr w:type="gramStart"/>
-      <w:r>
-        <w:rPr>
-          <w:lang w:eastAsia="cs-CZ"/>
-        </w:rPr>
-        <w:t>a.initials</w:t>
-      </w:r>
-      <w:proofErr w:type="gramEnd"/>
-      <w:r>
-        <w:rPr>
-          <w:lang w:eastAsia="cs-CZ"/>
-        </w:rPr>
-        <w:t>|czech}}, {{section5_worker_</w:t>
-      </w:r>
-      <w:proofErr w:type="gramStart"/>
-      <w:r>
-        <w:rPr>
-          <w:lang w:eastAsia="cs-CZ"/>
-        </w:rPr>
-        <w:t>b.initials</w:t>
-      </w:r>
-      <w:proofErr w:type="gramEnd"/>
-      <w:r>
-        <w:rPr>
-          <w:lang w:eastAsia="cs-CZ"/>
-        </w:rPr>
-        <w:t xml:space="preserve">|czech}}), </w:t>
+        <w:t xml:space="preserve">{{section4_worker_a.initials|czech}}, {{section5_worker_b.initials|czech}}), </w:t>
       </w:r>
       <w:r>
         <w:rPr>
@@ -1904,25 +1612,7 @@
           <w:szCs w:val="20"/>
           <w:lang w:eastAsia="cs-CZ"/>
         </w:rPr>
-        <w:t>{{section2_</w:t>
-      </w:r>
-      <w:proofErr w:type="gramStart"/>
-      <w:r>
-        <w:rPr>
-          <w:i/>
-          <w:szCs w:val="20"/>
-          <w:lang w:eastAsia="cs-CZ"/>
-        </w:rPr>
-        <w:t>firma.workplace</w:t>
-      </w:r>
-      <w:proofErr w:type="gramEnd"/>
-      <w:r>
-        <w:rPr>
-          <w:i/>
-          <w:szCs w:val="20"/>
-          <w:lang w:eastAsia="cs-CZ"/>
-        </w:rPr>
-        <w:t xml:space="preserve">|czech}} </w:t>
+        <w:t xml:space="preserve">{{section2_firma.workplace|czech}} </w:t>
       </w:r>
       <w:r>
         <w:rPr>
@@ -1938,27 +1628,7 @@
           <w:szCs w:val="20"/>
           <w:lang w:eastAsia="cs-CZ"/>
         </w:rPr>
-        <w:t>{{section2_</w:t>
-      </w:r>
-      <w:proofErr w:type="gramStart"/>
-      <w:r>
-        <w:rPr>
-          <w:rFonts w:cstheme="minorHAnsi"/>
-          <w:i/>
-          <w:szCs w:val="20"/>
-          <w:lang w:eastAsia="cs-CZ"/>
-        </w:rPr>
-        <w:t>firma.profession</w:t>
-      </w:r>
-      <w:proofErr w:type="gramEnd"/>
-      <w:r>
-        <w:rPr>
-          <w:rFonts w:cstheme="minorHAnsi"/>
-          <w:i/>
-          <w:szCs w:val="20"/>
-          <w:lang w:eastAsia="cs-CZ"/>
-        </w:rPr>
-        <w:t>_name|czech}}.</w:t>
+        <w:t>{{section2_firma.profession_name|czech}}.</w:t>
       </w:r>
       <w:r>
         <w:t xml:space="preserve"> </w:t>
@@ -2001,16 +1671,8 @@
         <w:rPr>
           <w:lang w:eastAsia="cs-CZ"/>
         </w:rPr>
-        <w:t>{{section4_worker_</w:t>
-      </w:r>
-      <w:proofErr w:type="gramStart"/>
-      <w:r>
-        <w:rPr>
-          <w:lang w:eastAsia="cs-CZ"/>
-        </w:rPr>
-        <w:t>a.breaks</w:t>
-      </w:r>
-      <w:proofErr w:type="gramEnd"/>
+        <w:t>{{section4_worker_a.breaks</w:t>
+      </w:r>
       <w:r>
         <w:rPr>
           <w:lang w:eastAsia="cs-CZ"/>
@@ -2041,13 +1703,13 @@
         <w:tblLook w:val="04A0" w:firstRow="1" w:lastRow="0" w:firstColumn="1" w:lastColumn="0" w:noHBand="0" w:noVBand="1"/>
       </w:tblPr>
       <w:tblGrid>
-        <w:gridCol w:w="2222"/>
-        <w:gridCol w:w="1143"/>
-        <w:gridCol w:w="1143"/>
-        <w:gridCol w:w="1143"/>
-        <w:gridCol w:w="1351"/>
-        <w:gridCol w:w="1143"/>
-        <w:gridCol w:w="1143"/>
+        <w:gridCol w:w="1806"/>
+        <w:gridCol w:w="951"/>
+        <w:gridCol w:w="951"/>
+        <w:gridCol w:w="1270"/>
+        <w:gridCol w:w="1746"/>
+        <w:gridCol w:w="1285"/>
+        <w:gridCol w:w="1279"/>
       </w:tblGrid>
       <w:tr>
         <w:trPr>
@@ -2484,86 +2146,68 @@
                 <w:rFonts w:cs="Calibri"/>
                 <w:szCs w:val="20"/>
               </w:rPr>
-              <w:t>{{section2_</w:t>
-            </w:r>
-            <w:proofErr w:type="gramStart"/>
-            <w:r>
-              <w:rPr>
-                <w:rFonts w:cs="Calibri"/>
+              <w:t>{{section2_firma.measurement_date|czech}}</w:t>
+            </w:r>
+          </w:p>
+        </w:tc>
+        <w:tc>
+          <w:tcPr>
+            <w:tcW w:w="701" w:type="pct"/>
+            <w:vAlign w:val="center"/>
+          </w:tcPr>
+          <w:p>
+            <w:pPr>
+              <w:jc w:val="center"/>
+              <w:rPr>
+                <w:rFonts w:cs="Calibri"/>
+                <w:bCs/>
                 <w:szCs w:val="20"/>
               </w:rPr>
-              <w:t>firma.measurement</w:t>
-            </w:r>
-            <w:proofErr w:type="gramEnd"/>
-            <w:r>
-              <w:rPr>
-                <w:rFonts w:cs="Calibri"/>
+            </w:pPr>
+            <w:r>
+              <w:rPr>
+                <w:rFonts w:cs="Calibri"/>
+                <w:bCs/>
                 <w:szCs w:val="20"/>
               </w:rPr>
-              <w:t>_date|czech}}</w:t>
-            </w:r>
-          </w:p>
-        </w:tc>
-        <w:tc>
-          <w:tcPr>
-            <w:tcW w:w="701" w:type="pct"/>
-            <w:vAlign w:val="center"/>
-          </w:tcPr>
-          <w:p>
-            <w:pPr>
-              <w:jc w:val="center"/>
+              <w:t>{{</w:t>
+            </w:r>
+            <w:r>
               <w:rPr>
                 <w:rFonts w:cs="Calibri"/>
                 <w:bCs/>
                 <w:szCs w:val="20"/>
               </w:rPr>
-            </w:pPr>
-            <w:r>
+              <w:t>section4_worker_a</w:t>
+            </w:r>
+          </w:p>
+          <w:p>
+            <w:pPr>
+              <w:jc w:val="center"/>
               <w:rPr>
                 <w:rFonts w:cs="Calibri"/>
                 <w:bCs/>
                 <w:szCs w:val="20"/>
               </w:rPr>
-              <w:t>{{</w:t>
-            </w:r>
+            </w:pPr>
             <w:r>
               <w:rPr>
                 <w:rFonts w:cs="Calibri"/>
                 <w:bCs/>
                 <w:szCs w:val="20"/>
               </w:rPr>
-              <w:t>section4_worker_a</w:t>
-            </w:r>
-          </w:p>
-          <w:p>
-            <w:pPr>
-              <w:jc w:val="center"/>
+              <w:t>.</w:t>
+            </w:r>
+            <w:proofErr w:type="spellStart"/>
+            <w:r>
               <w:rPr>
                 <w:rFonts w:cs="Calibri"/>
                 <w:bCs/>
                 <w:szCs w:val="20"/>
               </w:rPr>
-            </w:pPr>
-            <w:proofErr w:type="gramStart"/>
-            <w:r>
-              <w:rPr>
-                <w:rFonts w:cs="Calibri"/>
-                <w:bCs/>
-                <w:szCs w:val="20"/>
-              </w:rPr>
-              <w:t>.</w:t>
-            </w:r>
-            <w:proofErr w:type="spellStart"/>
-            <w:r>
-              <w:rPr>
-                <w:rFonts w:cs="Calibri"/>
-                <w:bCs/>
-                <w:szCs w:val="20"/>
-              </w:rPr>
               <w:t>initials</w:t>
             </w:r>
             <w:proofErr w:type="spellEnd"/>
-            <w:proofErr w:type="gramEnd"/>
             <w:r>
               <w:rPr>
                 <w:rFonts w:cs="Calibri"/>
@@ -2615,29 +2259,95 @@
                 <w:highlight w:val="yellow"/>
               </w:rPr>
             </w:pPr>
-            <w:proofErr w:type="gramStart"/>
             <w:r>
               <w:rPr>
                 <w:rFonts w:cs="Calibri"/>
                 <w:bCs/>
                 <w:szCs w:val="20"/>
               </w:rPr>
-              <w:t>.laterality</w:t>
-            </w:r>
-            <w:proofErr w:type="gramEnd"/>
-            <w:r>
+              <w:t>.laterality}}</w:t>
+            </w:r>
+          </w:p>
+        </w:tc>
+        <w:tc>
+          <w:tcPr>
+            <w:tcW w:w="698" w:type="pct"/>
+            <w:vAlign w:val="center"/>
+          </w:tcPr>
+          <w:p>
+            <w:pPr>
+              <w:jc w:val="center"/>
               <w:rPr>
                 <w:rFonts w:cs="Calibri"/>
                 <w:bCs/>
                 <w:szCs w:val="20"/>
               </w:rPr>
+            </w:pPr>
+            <w:r>
+              <w:rPr>
+                <w:rFonts w:cs="Calibri"/>
+                <w:bCs/>
+                <w:szCs w:val="20"/>
+              </w:rPr>
+              <w:t>{{</w:t>
+            </w:r>
+            <w:r>
+              <w:rPr>
+                <w:rFonts w:cs="Calibri"/>
+                <w:bCs/>
+                <w:szCs w:val="20"/>
+              </w:rPr>
+              <w:t>section4_worker_a</w:t>
+            </w:r>
+          </w:p>
+          <w:p>
+            <w:pPr>
+              <w:jc w:val="center"/>
+              <w:rPr>
+                <w:rFonts w:cs="Calibri"/>
+                <w:bCs/>
+                <w:szCs w:val="20"/>
+              </w:rPr>
+            </w:pPr>
+            <w:r>
+              <w:rPr>
+                <w:rFonts w:cs="Calibri"/>
+                <w:bCs/>
+                <w:szCs w:val="20"/>
+              </w:rPr>
+              <w:t>.</w:t>
+            </w:r>
+            <w:proofErr w:type="spellStart"/>
+            <w:r>
+              <w:rPr>
+                <w:rFonts w:cs="Calibri"/>
+                <w:bCs/>
+                <w:szCs w:val="20"/>
+              </w:rPr>
+              <w:t>age_years</w:t>
+            </w:r>
+            <w:r>
+              <w:rPr>
+                <w:rFonts w:cs="Calibri"/>
+                <w:bCs/>
+                <w:szCs w:val="20"/>
+              </w:rPr>
+              <w:t>|czech</w:t>
+            </w:r>
+            <w:proofErr w:type="spellEnd"/>
+            <w:r>
+              <w:rPr>
+                <w:rFonts w:cs="Calibri"/>
+                <w:bCs/>
+                <w:szCs w:val="20"/>
+              </w:rPr>
               <w:t>}}</w:t>
             </w:r>
           </w:p>
         </w:tc>
         <w:tc>
           <w:tcPr>
-            <w:tcW w:w="698" w:type="pct"/>
+            <w:tcW w:w="832" w:type="pct"/>
             <w:vAlign w:val="center"/>
           </w:tcPr>
           <w:p>
@@ -2675,7 +2385,6 @@
                 <w:szCs w:val="20"/>
               </w:rPr>
             </w:pPr>
-            <w:proofErr w:type="gramStart"/>
             <w:r>
               <w:rPr>
                 <w:rFonts w:cs="Calibri"/>
@@ -2691,16 +2400,15 @@
                 <w:bCs/>
                 <w:szCs w:val="20"/>
               </w:rPr>
-              <w:t>age</w:t>
-            </w:r>
-            <w:proofErr w:type="gramEnd"/>
+              <w:t>exposure_length_years</w:t>
+            </w:r>
             <w:r>
               <w:rPr>
                 <w:rFonts w:cs="Calibri"/>
                 <w:bCs/>
                 <w:szCs w:val="20"/>
               </w:rPr>
-              <w:t>_years</w:t>
+              <w:t>|czech</w:t>
             </w:r>
             <w:proofErr w:type="spellEnd"/>
             <w:r>
@@ -2715,7 +2423,7 @@
         </w:tc>
         <w:tc>
           <w:tcPr>
-            <w:tcW w:w="832" w:type="pct"/>
+            <w:tcW w:w="285" w:type="pct"/>
             <w:vAlign w:val="center"/>
           </w:tcPr>
           <w:p>
@@ -2753,7 +2461,6 @@
                 <w:szCs w:val="20"/>
               </w:rPr>
             </w:pPr>
-            <w:proofErr w:type="gramStart"/>
             <w:r>
               <w:rPr>
                 <w:rFonts w:cs="Calibri"/>
@@ -2769,16 +2476,15 @@
                 <w:bCs/>
                 <w:szCs w:val="20"/>
               </w:rPr>
-              <w:t>exposure</w:t>
-            </w:r>
-            <w:proofErr w:type="gramEnd"/>
+              <w:t>height_cm</w:t>
+            </w:r>
             <w:r>
               <w:rPr>
                 <w:rFonts w:cs="Calibri"/>
                 <w:bCs/>
                 <w:szCs w:val="20"/>
               </w:rPr>
-              <w:t>_length_years</w:t>
+              <w:t>|czech</w:t>
             </w:r>
             <w:proofErr w:type="spellEnd"/>
             <w:r>
@@ -2793,7 +2499,7 @@
         </w:tc>
         <w:tc>
           <w:tcPr>
-            <w:tcW w:w="285" w:type="pct"/>
+            <w:tcW w:w="403" w:type="pct"/>
             <w:vAlign w:val="center"/>
           </w:tcPr>
           <w:p>
@@ -2831,7 +2537,6 @@
                 <w:szCs w:val="20"/>
               </w:rPr>
             </w:pPr>
-            <w:proofErr w:type="gramStart"/>
             <w:r>
               <w:rPr>
                 <w:rFonts w:cs="Calibri"/>
@@ -2847,94 +2552,15 @@
                 <w:bCs/>
                 <w:szCs w:val="20"/>
               </w:rPr>
-              <w:t>height</w:t>
-            </w:r>
-            <w:proofErr w:type="gramEnd"/>
+              <w:t>weight_kg</w:t>
+            </w:r>
             <w:r>
               <w:rPr>
                 <w:rFonts w:cs="Calibri"/>
                 <w:bCs/>
                 <w:szCs w:val="20"/>
               </w:rPr>
-              <w:t>_cm</w:t>
-            </w:r>
-            <w:proofErr w:type="spellEnd"/>
-            <w:r>
-              <w:rPr>
-                <w:rFonts w:cs="Calibri"/>
-                <w:bCs/>
-                <w:szCs w:val="20"/>
-              </w:rPr>
-              <w:t>}}</w:t>
-            </w:r>
-          </w:p>
-        </w:tc>
-        <w:tc>
-          <w:tcPr>
-            <w:tcW w:w="403" w:type="pct"/>
-            <w:vAlign w:val="center"/>
-          </w:tcPr>
-          <w:p>
-            <w:pPr>
-              <w:jc w:val="center"/>
-              <w:rPr>
-                <w:rFonts w:cs="Calibri"/>
-                <w:bCs/>
-                <w:szCs w:val="20"/>
-              </w:rPr>
-            </w:pPr>
-            <w:r>
-              <w:rPr>
-                <w:rFonts w:cs="Calibri"/>
-                <w:bCs/>
-                <w:szCs w:val="20"/>
-              </w:rPr>
-              <w:t>{{</w:t>
-            </w:r>
-            <w:r>
-              <w:rPr>
-                <w:rFonts w:cs="Calibri"/>
-                <w:bCs/>
-                <w:szCs w:val="20"/>
-              </w:rPr>
-              <w:t>section4_worker_a</w:t>
-            </w:r>
-          </w:p>
-          <w:p>
-            <w:pPr>
-              <w:jc w:val="center"/>
-              <w:rPr>
-                <w:rFonts w:cs="Calibri"/>
-                <w:bCs/>
-                <w:szCs w:val="20"/>
-              </w:rPr>
-            </w:pPr>
-            <w:proofErr w:type="gramStart"/>
-            <w:r>
-              <w:rPr>
-                <w:rFonts w:cs="Calibri"/>
-                <w:bCs/>
-                <w:szCs w:val="20"/>
-              </w:rPr>
-              <w:t>.</w:t>
-            </w:r>
-            <w:proofErr w:type="spellStart"/>
-            <w:r>
-              <w:rPr>
-                <w:rFonts w:cs="Calibri"/>
-                <w:bCs/>
-                <w:szCs w:val="20"/>
-              </w:rPr>
-              <w:t>weight</w:t>
-            </w:r>
-            <w:proofErr w:type="gramEnd"/>
-            <w:r>
-              <w:rPr>
-                <w:rFonts w:cs="Calibri"/>
-                <w:bCs/>
-                <w:szCs w:val="20"/>
-              </w:rPr>
-              <w:t>_kg</w:t>
+              <w:t>|czech</w:t>
             </w:r>
             <w:proofErr w:type="spellEnd"/>
             <w:r>
@@ -2972,46 +2598,122 @@
                 <w:rFonts w:cs="Calibri"/>
                 <w:szCs w:val="20"/>
               </w:rPr>
-              <w:t>{{section2_</w:t>
-            </w:r>
-            <w:proofErr w:type="gramStart"/>
-            <w:r>
-              <w:rPr>
-                <w:rFonts w:cs="Calibri"/>
+              <w:t>{{section2_firma.measurement_date|czech}}</w:t>
+            </w:r>
+          </w:p>
+        </w:tc>
+        <w:tc>
+          <w:tcPr>
+            <w:tcW w:w="701" w:type="pct"/>
+            <w:vAlign w:val="center"/>
+          </w:tcPr>
+          <w:p>
+            <w:pPr>
+              <w:jc w:val="center"/>
+              <w:rPr>
+                <w:rFonts w:cs="Calibri"/>
+                <w:bCs/>
                 <w:szCs w:val="20"/>
               </w:rPr>
-              <w:t>firma.measurement</w:t>
-            </w:r>
-            <w:proofErr w:type="gramEnd"/>
-            <w:r>
-              <w:rPr>
-                <w:rFonts w:cs="Calibri"/>
+            </w:pPr>
+            <w:r>
+              <w:rPr>
+                <w:rFonts w:cs="Calibri"/>
+                <w:bCs/>
                 <w:szCs w:val="20"/>
               </w:rPr>
-              <w:t>_date|czech}}</w:t>
-            </w:r>
-          </w:p>
-        </w:tc>
-        <w:tc>
-          <w:tcPr>
-            <w:tcW w:w="701" w:type="pct"/>
-            <w:vAlign w:val="center"/>
-          </w:tcPr>
-          <w:p>
-            <w:pPr>
-              <w:jc w:val="center"/>
+              <w:t>{{</w:t>
+            </w:r>
+            <w:r>
               <w:rPr>
                 <w:rFonts w:cs="Calibri"/>
                 <w:bCs/>
                 <w:szCs w:val="20"/>
               </w:rPr>
-            </w:pPr>
+              <w:t>section</w:t>
+            </w:r>
             <w:r>
               <w:rPr>
                 <w:rFonts w:cs="Calibri"/>
                 <w:bCs/>
                 <w:szCs w:val="20"/>
               </w:rPr>
+              <w:t>5</w:t>
+            </w:r>
+            <w:r>
+              <w:rPr>
+                <w:rFonts w:cs="Calibri"/>
+                <w:bCs/>
+                <w:szCs w:val="20"/>
+              </w:rPr>
+              <w:t>_worker_</w:t>
+            </w:r>
+            <w:r>
+              <w:rPr>
+                <w:rFonts w:cs="Calibri"/>
+                <w:bCs/>
+                <w:szCs w:val="20"/>
+              </w:rPr>
+              <w:t>b</w:t>
+            </w:r>
+          </w:p>
+          <w:p>
+            <w:pPr>
+              <w:jc w:val="center"/>
+              <w:rPr>
+                <w:rFonts w:cs="Calibri"/>
+                <w:bCs/>
+                <w:szCs w:val="20"/>
+              </w:rPr>
+            </w:pPr>
+            <w:r>
+              <w:rPr>
+                <w:rFonts w:cs="Calibri"/>
+                <w:bCs/>
+                <w:szCs w:val="20"/>
+              </w:rPr>
+              <w:t>.</w:t>
+            </w:r>
+            <w:proofErr w:type="spellStart"/>
+            <w:r>
+              <w:rPr>
+                <w:rFonts w:cs="Calibri"/>
+                <w:bCs/>
+                <w:szCs w:val="20"/>
+              </w:rPr>
+              <w:t>initials</w:t>
+            </w:r>
+            <w:proofErr w:type="spellEnd"/>
+            <w:r>
+              <w:rPr>
+                <w:rFonts w:cs="Calibri"/>
+                <w:bCs/>
+                <w:szCs w:val="20"/>
+              </w:rPr>
+              <w:t>}}</w:t>
+            </w:r>
+          </w:p>
+        </w:tc>
+        <w:tc>
+          <w:tcPr>
+            <w:tcW w:w="698" w:type="pct"/>
+            <w:vAlign w:val="center"/>
+          </w:tcPr>
+          <w:p>
+            <w:pPr>
+              <w:jc w:val="center"/>
+              <w:rPr>
+                <w:rFonts w:cs="Calibri"/>
+                <w:bCs/>
+                <w:szCs w:val="20"/>
+              </w:rPr>
+            </w:pPr>
+            <w:r>
+              <w:rPr>
+                <w:rFonts w:cs="Calibri"/>
+                <w:bCs/>
+                <w:szCs w:val="20"/>
+              </w:rPr>
               <w:t>{{</w:t>
             </w:r>
             <w:r>
@@ -3056,13 +2758,86 @@
                 <w:szCs w:val="20"/>
               </w:rPr>
             </w:pPr>
-            <w:proofErr w:type="gramStart"/>
             <w:r>
               <w:rPr>
                 <w:rFonts w:cs="Calibri"/>
                 <w:bCs/>
                 <w:szCs w:val="20"/>
               </w:rPr>
+              <w:t>.laterality}}</w:t>
+            </w:r>
+          </w:p>
+        </w:tc>
+        <w:tc>
+          <w:tcPr>
+            <w:tcW w:w="698" w:type="pct"/>
+            <w:vAlign w:val="center"/>
+          </w:tcPr>
+          <w:p>
+            <w:pPr>
+              <w:jc w:val="center"/>
+              <w:rPr>
+                <w:rFonts w:cs="Calibri"/>
+                <w:bCs/>
+                <w:szCs w:val="20"/>
+              </w:rPr>
+            </w:pPr>
+            <w:r>
+              <w:rPr>
+                <w:rFonts w:cs="Calibri"/>
+                <w:bCs/>
+                <w:szCs w:val="20"/>
+              </w:rPr>
+              <w:t>{{</w:t>
+            </w:r>
+            <w:r>
+              <w:rPr>
+                <w:rFonts w:cs="Calibri"/>
+                <w:bCs/>
+                <w:szCs w:val="20"/>
+              </w:rPr>
+              <w:t>section</w:t>
+            </w:r>
+            <w:r>
+              <w:rPr>
+                <w:rFonts w:cs="Calibri"/>
+                <w:bCs/>
+                <w:szCs w:val="20"/>
+              </w:rPr>
+              <w:t>5</w:t>
+            </w:r>
+            <w:r>
+              <w:rPr>
+                <w:rFonts w:cs="Calibri"/>
+                <w:bCs/>
+                <w:szCs w:val="20"/>
+              </w:rPr>
+              <w:t>_worker_</w:t>
+            </w:r>
+            <w:r>
+              <w:rPr>
+                <w:rFonts w:cs="Calibri"/>
+                <w:bCs/>
+                <w:szCs w:val="20"/>
+              </w:rPr>
+              <w:t>b</w:t>
+            </w:r>
+          </w:p>
+          <w:p>
+            <w:pPr>
+              <w:jc w:val="center"/>
+              <w:rPr>
+                <w:rFonts w:cs="Calibri"/>
+                <w:bCs/>
+                <w:szCs w:val="20"/>
+              </w:rPr>
+            </w:pPr>
+            <w:r>
+              <w:rPr>
+                <w:rFonts w:cs="Calibri"/>
+                <w:bCs/>
+                <w:szCs w:val="20"/>
+              </w:rPr>
               <w:t>.</w:t>
             </w:r>
             <w:proofErr w:type="spellStart"/>
@@ -3072,10 +2847,17 @@
                 <w:bCs/>
                 <w:szCs w:val="20"/>
               </w:rPr>
-              <w:t>initials</w:t>
+              <w:t>age_years</w:t>
+            </w:r>
+            <w:r>
+              <w:rPr>
+                <w:rFonts w:cs="Calibri"/>
+                <w:bCs/>
+                <w:szCs w:val="20"/>
+              </w:rPr>
+              <w:t>|czech</w:t>
             </w:r>
             <w:proofErr w:type="spellEnd"/>
-            <w:proofErr w:type="gramEnd"/>
             <w:r>
               <w:rPr>
                 <w:rFonts w:cs="Calibri"/>
@@ -3088,7 +2870,7 @@
         </w:tc>
         <w:tc>
           <w:tcPr>
-            <w:tcW w:w="698" w:type="pct"/>
+            <w:tcW w:w="832" w:type="pct"/>
             <w:vAlign w:val="center"/>
           </w:tcPr>
           <w:p>
@@ -3150,29 +2932,45 @@
                 <w:szCs w:val="20"/>
               </w:rPr>
             </w:pPr>
-            <w:proofErr w:type="gramStart"/>
             <w:r>
               <w:rPr>
                 <w:rFonts w:cs="Calibri"/>
                 <w:bCs/>
                 <w:szCs w:val="20"/>
               </w:rPr>
-              <w:t>.laterality</w:t>
-            </w:r>
-            <w:proofErr w:type="gramEnd"/>
+              <w:t>.</w:t>
+            </w:r>
+            <w:proofErr w:type="spellStart"/>
             <w:r>
               <w:rPr>
                 <w:rFonts w:cs="Calibri"/>
                 <w:bCs/>
                 <w:szCs w:val="20"/>
               </w:rPr>
+              <w:t>exposure_length_years</w:t>
+            </w:r>
+            <w:r>
+              <w:rPr>
+                <w:rFonts w:cs="Calibri"/>
+                <w:bCs/>
+                <w:szCs w:val="20"/>
+              </w:rPr>
+              <w:t>|czech</w:t>
+            </w:r>
+            <w:proofErr w:type="spellEnd"/>
+            <w:r>
+              <w:rPr>
+                <w:rFonts w:cs="Calibri"/>
+                <w:bCs/>
+                <w:szCs w:val="20"/>
+              </w:rPr>
               <w:t>}}</w:t>
             </w:r>
           </w:p>
         </w:tc>
         <w:tc>
           <w:tcPr>
-            <w:tcW w:w="698" w:type="pct"/>
+            <w:tcW w:w="285" w:type="pct"/>
             <w:vAlign w:val="center"/>
           </w:tcPr>
           <w:p>
@@ -3234,7 +3032,6 @@
                 <w:szCs w:val="20"/>
               </w:rPr>
             </w:pPr>
-            <w:proofErr w:type="gramStart"/>
             <w:r>
               <w:rPr>
                 <w:rFonts w:cs="Calibri"/>
@@ -3250,16 +3047,15 @@
                 <w:bCs/>
                 <w:szCs w:val="20"/>
               </w:rPr>
-              <w:t>age</w:t>
-            </w:r>
-            <w:proofErr w:type="gramEnd"/>
+              <w:t>height_cm</w:t>
+            </w:r>
             <w:r>
               <w:rPr>
                 <w:rFonts w:cs="Calibri"/>
                 <w:bCs/>
                 <w:szCs w:val="20"/>
               </w:rPr>
-              <w:t>_years</w:t>
+              <w:t>|czech</w:t>
             </w:r>
             <w:proofErr w:type="spellEnd"/>
             <w:r>
@@ -3274,7 +3070,7 @@
         </w:tc>
         <w:tc>
           <w:tcPr>
-            <w:tcW w:w="832" w:type="pct"/>
+            <w:tcW w:w="403" w:type="pct"/>
             <w:vAlign w:val="center"/>
           </w:tcPr>
           <w:p>
@@ -3336,7 +3132,6 @@
                 <w:szCs w:val="20"/>
               </w:rPr>
             </w:pPr>
-            <w:proofErr w:type="gramStart"/>
             <w:r>
               <w:rPr>
                 <w:rFonts w:cs="Calibri"/>
@@ -3352,220 +3147,15 @@
                 <w:bCs/>
                 <w:szCs w:val="20"/>
               </w:rPr>
-              <w:t>exposure</w:t>
-            </w:r>
-            <w:proofErr w:type="gramEnd"/>
+              <w:t>weight_kg</w:t>
+            </w:r>
             <w:r>
               <w:rPr>
                 <w:rFonts w:cs="Calibri"/>
                 <w:bCs/>
                 <w:szCs w:val="20"/>
               </w:rPr>
-              <w:t>_length_years</w:t>
-            </w:r>
-            <w:proofErr w:type="spellEnd"/>
-            <w:r>
-              <w:rPr>
-                <w:rFonts w:cs="Calibri"/>
-                <w:bCs/>
-                <w:szCs w:val="20"/>
-              </w:rPr>
-              <w:t>}}</w:t>
-            </w:r>
-          </w:p>
-        </w:tc>
-        <w:tc>
-          <w:tcPr>
-            <w:tcW w:w="285" w:type="pct"/>
-            <w:vAlign w:val="center"/>
-          </w:tcPr>
-          <w:p>
-            <w:pPr>
-              <w:jc w:val="center"/>
-              <w:rPr>
-                <w:rFonts w:cs="Calibri"/>
-                <w:bCs/>
-                <w:szCs w:val="20"/>
-              </w:rPr>
-            </w:pPr>
-            <w:r>
-              <w:rPr>
-                <w:rFonts w:cs="Calibri"/>
-                <w:bCs/>
-                <w:szCs w:val="20"/>
-              </w:rPr>
-              <w:t>{{</w:t>
-            </w:r>
-            <w:r>
-              <w:rPr>
-                <w:rFonts w:cs="Calibri"/>
-                <w:bCs/>
-                <w:szCs w:val="20"/>
-              </w:rPr>
-              <w:t>section</w:t>
-            </w:r>
-            <w:r>
-              <w:rPr>
-                <w:rFonts w:cs="Calibri"/>
-                <w:bCs/>
-                <w:szCs w:val="20"/>
-              </w:rPr>
-              <w:t>5</w:t>
-            </w:r>
-            <w:r>
-              <w:rPr>
-                <w:rFonts w:cs="Calibri"/>
-                <w:bCs/>
-                <w:szCs w:val="20"/>
-              </w:rPr>
-              <w:t>_worker_</w:t>
-            </w:r>
-            <w:r>
-              <w:rPr>
-                <w:rFonts w:cs="Calibri"/>
-                <w:bCs/>
-                <w:szCs w:val="20"/>
-              </w:rPr>
-              <w:t>b</w:t>
-            </w:r>
-          </w:p>
-          <w:p>
-            <w:pPr>
-              <w:jc w:val="center"/>
-              <w:rPr>
-                <w:rFonts w:cs="Calibri"/>
-                <w:bCs/>
-                <w:szCs w:val="20"/>
-              </w:rPr>
-            </w:pPr>
-            <w:proofErr w:type="gramStart"/>
-            <w:r>
-              <w:rPr>
-                <w:rFonts w:cs="Calibri"/>
-                <w:bCs/>
-                <w:szCs w:val="20"/>
-              </w:rPr>
-              <w:t>.</w:t>
-            </w:r>
-            <w:proofErr w:type="spellStart"/>
-            <w:r>
-              <w:rPr>
-                <w:rFonts w:cs="Calibri"/>
-                <w:bCs/>
-                <w:szCs w:val="20"/>
-              </w:rPr>
-              <w:t>height</w:t>
-            </w:r>
-            <w:proofErr w:type="gramEnd"/>
-            <w:r>
-              <w:rPr>
-                <w:rFonts w:cs="Calibri"/>
-                <w:bCs/>
-                <w:szCs w:val="20"/>
-              </w:rPr>
-              <w:t>_cm</w:t>
-            </w:r>
-            <w:proofErr w:type="spellEnd"/>
-            <w:r>
-              <w:rPr>
-                <w:rFonts w:cs="Calibri"/>
-                <w:bCs/>
-                <w:szCs w:val="20"/>
-              </w:rPr>
-              <w:t>}}</w:t>
-            </w:r>
-          </w:p>
-        </w:tc>
-        <w:tc>
-          <w:tcPr>
-            <w:tcW w:w="403" w:type="pct"/>
-            <w:vAlign w:val="center"/>
-          </w:tcPr>
-          <w:p>
-            <w:pPr>
-              <w:jc w:val="center"/>
-              <w:rPr>
-                <w:rFonts w:cs="Calibri"/>
-                <w:bCs/>
-                <w:szCs w:val="20"/>
-              </w:rPr>
-            </w:pPr>
-            <w:r>
-              <w:rPr>
-                <w:rFonts w:cs="Calibri"/>
-                <w:bCs/>
-                <w:szCs w:val="20"/>
-              </w:rPr>
-              <w:t>{{</w:t>
-            </w:r>
-            <w:r>
-              <w:rPr>
-                <w:rFonts w:cs="Calibri"/>
-                <w:bCs/>
-                <w:szCs w:val="20"/>
-              </w:rPr>
-              <w:t>section</w:t>
-            </w:r>
-            <w:r>
-              <w:rPr>
-                <w:rFonts w:cs="Calibri"/>
-                <w:bCs/>
-                <w:szCs w:val="20"/>
-              </w:rPr>
-              <w:t>5</w:t>
-            </w:r>
-            <w:r>
-              <w:rPr>
-                <w:rFonts w:cs="Calibri"/>
-                <w:bCs/>
-                <w:szCs w:val="20"/>
-              </w:rPr>
-              <w:t>_worker_</w:t>
-            </w:r>
-            <w:r>
-              <w:rPr>
-                <w:rFonts w:cs="Calibri"/>
-                <w:bCs/>
-                <w:szCs w:val="20"/>
-              </w:rPr>
-              <w:t>b</w:t>
-            </w:r>
-          </w:p>
-          <w:p>
-            <w:pPr>
-              <w:jc w:val="center"/>
-              <w:rPr>
-                <w:rFonts w:cs="Calibri"/>
-                <w:bCs/>
-                <w:szCs w:val="20"/>
-              </w:rPr>
-            </w:pPr>
-            <w:proofErr w:type="gramStart"/>
-            <w:r>
-              <w:rPr>
-                <w:rFonts w:cs="Calibri"/>
-                <w:bCs/>
-                <w:szCs w:val="20"/>
-              </w:rPr>
-              <w:t>.</w:t>
-            </w:r>
-            <w:proofErr w:type="spellStart"/>
-            <w:r>
-              <w:rPr>
-                <w:rFonts w:cs="Calibri"/>
-                <w:bCs/>
-                <w:szCs w:val="20"/>
-              </w:rPr>
-              <w:t>weight</w:t>
-            </w:r>
-            <w:proofErr w:type="gramEnd"/>
-            <w:r>
-              <w:rPr>
-                <w:rFonts w:cs="Calibri"/>
-                <w:bCs/>
-                <w:szCs w:val="20"/>
-              </w:rPr>
-              <w:t>_kg</w:t>
+              <w:t>|czech</w:t>
             </w:r>
             <w:proofErr w:type="spellEnd"/>
             <w:r>
@@ -3626,6 +3216,58 @@
                 <w:szCs w:val="20"/>
               </w:rPr>
             </w:pPr>
+            <w:r>
+              <w:rPr>
+                <w:rFonts w:cs="Calibri"/>
+                <w:b/>
+                <w:szCs w:val="20"/>
+              </w:rPr>
+              <w:t>{{</w:t>
+            </w:r>
+            <w:proofErr w:type="spellStart"/>
+            <w:r>
+              <w:rPr>
+                <w:rFonts w:cs="Calibri"/>
+                <w:b/>
+                <w:szCs w:val="20"/>
+              </w:rPr>
+              <w:t>prumery.age_years</w:t>
+            </w:r>
+            <w:proofErr w:type="spellEnd"/>
+            <w:r>
+              <w:rPr>
+                <w:rFonts w:cs="Calibri"/>
+                <w:b/>
+                <w:szCs w:val="20"/>
+              </w:rPr>
+              <w:t>}</w:t>
+            </w:r>
+            <w:r>
+              <w:rPr>
+                <w:rFonts w:cs="Calibri"/>
+                <w:b/>
+                <w:szCs w:val="20"/>
+              </w:rPr>
+              <w:t>|</w:t>
+            </w:r>
+            <w:proofErr w:type="spellStart"/>
+            <w:r>
+              <w:rPr>
+                <w:rFonts w:cs="Calibri"/>
+                <w:b/>
+                <w:szCs w:val="20"/>
+              </w:rPr>
+              <w:t>czech</w:t>
+            </w:r>
+            <w:proofErr w:type="spellEnd"/>
+            <w:r>
+              <w:rPr>
+                <w:rFonts w:cs="Calibri"/>
+                <w:b/>
+                <w:szCs w:val="20"/>
+              </w:rPr>
+              <w:t>}</w:t>
+            </w:r>
           </w:p>
         </w:tc>
         <w:tc>
@@ -3643,6 +3285,40 @@
                 <w:szCs w:val="20"/>
               </w:rPr>
             </w:pPr>
+            <w:r>
+              <w:rPr>
+                <w:rFonts w:cs="Calibri"/>
+                <w:b/>
+                <w:szCs w:val="20"/>
+              </w:rPr>
+              <w:t>{{</w:t>
+            </w:r>
+            <w:proofErr w:type="spellStart"/>
+            <w:r>
+              <w:rPr>
+                <w:rFonts w:cs="Calibri"/>
+                <w:b/>
+                <w:szCs w:val="20"/>
+              </w:rPr>
+              <w:t>prumery.exposure_length_years</w:t>
+            </w:r>
+            <w:r>
+              <w:rPr>
+                <w:rFonts w:cs="Calibri"/>
+                <w:b/>
+                <w:szCs w:val="20"/>
+              </w:rPr>
+              <w:t>|czech</w:t>
+            </w:r>
+            <w:proofErr w:type="spellEnd"/>
+            <w:r>
+              <w:rPr>
+                <w:rFonts w:cs="Calibri"/>
+                <w:b/>
+                <w:szCs w:val="20"/>
+              </w:rPr>
+              <w:t>}}</w:t>
+            </w:r>
           </w:p>
         </w:tc>
         <w:tc>
@@ -3660,6 +3336,40 @@
                 <w:szCs w:val="20"/>
               </w:rPr>
             </w:pPr>
+            <w:r>
+              <w:rPr>
+                <w:rFonts w:cs="Calibri"/>
+                <w:b/>
+                <w:szCs w:val="20"/>
+              </w:rPr>
+              <w:t>{{</w:t>
+            </w:r>
+            <w:proofErr w:type="spellStart"/>
+            <w:r>
+              <w:rPr>
+                <w:rFonts w:cs="Calibri"/>
+                <w:b/>
+                <w:szCs w:val="20"/>
+              </w:rPr>
+              <w:t>prumery.height_cm</w:t>
+            </w:r>
+            <w:r>
+              <w:rPr>
+                <w:rFonts w:cs="Calibri"/>
+                <w:b/>
+                <w:szCs w:val="20"/>
+              </w:rPr>
+              <w:t>|czech</w:t>
+            </w:r>
+            <w:proofErr w:type="spellEnd"/>
+            <w:r>
+              <w:rPr>
+                <w:rFonts w:cs="Calibri"/>
+                <w:b/>
+                <w:szCs w:val="20"/>
+              </w:rPr>
+              <w:t>}}</w:t>
+            </w:r>
           </w:p>
         </w:tc>
         <w:tc>
@@ -3677,6 +3387,40 @@
                 <w:szCs w:val="20"/>
               </w:rPr>
             </w:pPr>
+            <w:r>
+              <w:rPr>
+                <w:rFonts w:cs="Calibri"/>
+                <w:b/>
+                <w:szCs w:val="20"/>
+              </w:rPr>
+              <w:t>{{</w:t>
+            </w:r>
+            <w:proofErr w:type="spellStart"/>
+            <w:r>
+              <w:rPr>
+                <w:rFonts w:cs="Calibri"/>
+                <w:b/>
+                <w:szCs w:val="20"/>
+              </w:rPr>
+              <w:t>prumery.weight_kg</w:t>
+            </w:r>
+            <w:r>
+              <w:rPr>
+                <w:rFonts w:cs="Calibri"/>
+                <w:b/>
+                <w:szCs w:val="20"/>
+              </w:rPr>
+              <w:t>|czech</w:t>
+            </w:r>
+            <w:proofErr w:type="spellEnd"/>
+            <w:r>
+              <w:rPr>
+                <w:rFonts w:cs="Calibri"/>
+                <w:b/>
+                <w:szCs w:val="20"/>
+              </w:rPr>
+              <w:t>}}</w:t>
+            </w:r>
           </w:p>
         </w:tc>
       </w:tr>
@@ -17249,35 +16993,7 @@
               <w:rPr>
                 <w:lang w:eastAsia="cs-CZ"/>
               </w:rPr>
-              <w:t>{{section4_worker_</w:t>
-            </w:r>
-            <w:proofErr w:type="gramStart"/>
-            <w:r>
-              <w:rPr>
-                <w:lang w:eastAsia="cs-CZ"/>
-              </w:rPr>
-              <w:t>a.initials</w:t>
-            </w:r>
-            <w:proofErr w:type="gramEnd"/>
-            <w:r>
-              <w:rPr>
-                <w:lang w:eastAsia="cs-CZ"/>
-              </w:rPr>
-              <w:t>|czech}}, {{section5_worker_</w:t>
-            </w:r>
-            <w:proofErr w:type="gramStart"/>
-            <w:r>
-              <w:rPr>
-                <w:lang w:eastAsia="cs-CZ"/>
-              </w:rPr>
-              <w:t>b.initials</w:t>
-            </w:r>
-            <w:proofErr w:type="gramEnd"/>
-            <w:r>
-              <w:rPr>
-                <w:lang w:eastAsia="cs-CZ"/>
-              </w:rPr>
-              <w:t>|czech}}</w:t>
+              <w:t>{{section4_worker_a.initials|czech}}, {{section5_worker_b.initials|czech}}</w:t>
             </w:r>
           </w:p>
         </w:tc>
@@ -17346,27 +17062,7 @@
                 <w:szCs w:val="20"/>
                 <w:lang w:eastAsia="cs-CZ"/>
               </w:rPr>
-              <w:t>{{section2_</w:t>
-            </w:r>
-            <w:proofErr w:type="gramStart"/>
-            <w:r>
-              <w:rPr>
-                <w:rFonts w:cstheme="minorHAnsi"/>
-                <w:bCs/>
-                <w:szCs w:val="20"/>
-                <w:lang w:eastAsia="cs-CZ"/>
-              </w:rPr>
-              <w:t>firma.profession</w:t>
-            </w:r>
-            <w:proofErr w:type="gramEnd"/>
-            <w:r>
-              <w:rPr>
-                <w:rFonts w:cstheme="minorHAnsi"/>
-                <w:bCs/>
-                <w:szCs w:val="20"/>
-                <w:lang w:eastAsia="cs-CZ"/>
-              </w:rPr>
-              <w:t>_name|czech}}</w:t>
+              <w:t>{{section2_firma.profession_name|czech}}</w:t>
             </w:r>
           </w:p>
         </w:tc>
@@ -17436,27 +17132,7 @@
                 <w:szCs w:val="20"/>
                 <w:lang w:eastAsia="cs-CZ"/>
               </w:rPr>
-              <w:t>{{section2_</w:t>
-            </w:r>
-            <w:proofErr w:type="gramStart"/>
-            <w:r>
-              <w:rPr>
-                <w:rFonts w:cstheme="minorHAnsi"/>
-                <w:bCs/>
-                <w:szCs w:val="20"/>
-                <w:lang w:eastAsia="cs-CZ"/>
-              </w:rPr>
-              <w:t>firma.workplace</w:t>
-            </w:r>
-            <w:proofErr w:type="gramEnd"/>
-            <w:r>
-              <w:rPr>
-                <w:rFonts w:cstheme="minorHAnsi"/>
-                <w:bCs/>
-                <w:szCs w:val="20"/>
-                <w:lang w:eastAsia="cs-CZ"/>
-              </w:rPr>
-              <w:t>|czech}}</w:t>
+              <w:t>{{section2_firma.workplace|czech}}</w:t>
             </w:r>
           </w:p>
         </w:tc>
@@ -17557,27 +17233,7 @@
                 <w:szCs w:val="20"/>
                 <w:lang w:eastAsia="cs-CZ"/>
               </w:rPr>
-              <w:t>{{section4_worker_</w:t>
-            </w:r>
-            <w:proofErr w:type="gramStart"/>
-            <w:r>
-              <w:rPr>
-                <w:rFonts w:cstheme="minorHAnsi"/>
-                <w:bCs/>
-                <w:szCs w:val="20"/>
-                <w:lang w:eastAsia="cs-CZ"/>
-              </w:rPr>
-              <w:t>a.work</w:t>
-            </w:r>
-            <w:proofErr w:type="gramEnd"/>
-            <w:r>
-              <w:rPr>
-                <w:rFonts w:cstheme="minorHAnsi"/>
-                <w:bCs/>
-                <w:szCs w:val="20"/>
-                <w:lang w:eastAsia="cs-CZ"/>
-              </w:rPr>
-              <w:t>_duration|czech}}</w:t>
+              <w:t>{{section4_worker_a.work_duration|czech}}</w:t>
             </w:r>
             <w:r>
               <w:rPr>
@@ -17654,27 +17310,7 @@
                 <w:szCs w:val="20"/>
                 <w:lang w:eastAsia="cs-CZ"/>
               </w:rPr>
-              <w:t>{{section4_worker_</w:t>
-            </w:r>
-            <w:proofErr w:type="gramStart"/>
-            <w:r>
-              <w:rPr>
-                <w:rFonts w:cstheme="minorHAnsi"/>
-                <w:b/>
-                <w:szCs w:val="20"/>
-                <w:lang w:eastAsia="cs-CZ"/>
-              </w:rPr>
-              <w:t>a.breaks</w:t>
-            </w:r>
-            <w:proofErr w:type="gramEnd"/>
-            <w:r>
-              <w:rPr>
-                <w:rFonts w:cstheme="minorHAnsi"/>
-                <w:b/>
-                <w:szCs w:val="20"/>
-                <w:lang w:eastAsia="cs-CZ"/>
-              </w:rPr>
-              <w:t xml:space="preserve">|czech}} </w:t>
+              <w:t xml:space="preserve">{{section4_worker_a.breaks|czech}} </w:t>
             </w:r>
             <w:r>
               <w:rPr>
@@ -17742,19 +17378,17 @@
                 <w:szCs w:val="20"/>
                 <w:lang w:eastAsia="cs-CZ"/>
               </w:rPr>
-              <w:t>{{section4_worker_</w:t>
-            </w:r>
-            <w:proofErr w:type="gramStart"/>
+              <w:t>{{section4_worker_a.work_duration_min|czech}}</w:t>
+            </w:r>
             <w:r>
               <w:rPr>
                 <w:rFonts w:cstheme="minorHAnsi"/>
-                <w:bCs/>
+                <w:b/>
                 <w:szCs w:val="20"/>
                 <w:lang w:eastAsia="cs-CZ"/>
               </w:rPr>
-              <w:t>a.work</w:t>
-            </w:r>
-            <w:proofErr w:type="gramEnd"/>
+              <w:t xml:space="preserve"> </w:t>
+            </w:r>
             <w:r>
               <w:rPr>
                 <w:rFonts w:cstheme="minorHAnsi"/>
@@ -17762,9 +17396,8 @@
                 <w:szCs w:val="20"/>
                 <w:lang w:eastAsia="cs-CZ"/>
               </w:rPr>
-              <w:t>_duration_min|czech</w:t>
-            </w:r>
-            <w:proofErr w:type="gramStart"/>
+              <w:t xml:space="preserve"> min</w:t>
+            </w:r>
             <w:r>
               <w:rPr>
                 <w:rFonts w:cstheme="minorHAnsi"/>
@@ -17772,15 +17405,24 @@
                 <w:szCs w:val="20"/>
                 <w:lang w:eastAsia="cs-CZ"/>
               </w:rPr>
-              <w:t>}}</w:t>
+              <w:t xml:space="preserve"> + </w:t>
             </w:r>
             <w:r>
               <w:rPr>
                 <w:rFonts w:cstheme="minorHAnsi"/>
-                <w:b/>
+                <w:bCs/>
                 <w:szCs w:val="20"/>
                 <w:lang w:eastAsia="cs-CZ"/>
               </w:rPr>
+              <w:t>{{section4_worker_a.safety_break_min|czech}}</w:t>
+            </w:r>
+            <w:r>
+              <w:rPr>
+                <w:rFonts w:cstheme="minorHAnsi"/>
+                <w:b/>
+                <w:szCs w:val="20"/>
+                <w:lang w:eastAsia="cs-CZ"/>
+              </w:rPr>
               <w:t xml:space="preserve"> </w:t>
             </w:r>
             <w:r>
@@ -17790,9 +17432,8 @@
                 <w:szCs w:val="20"/>
                 <w:lang w:eastAsia="cs-CZ"/>
               </w:rPr>
-              <w:t xml:space="preserve"> min</w:t>
-            </w:r>
-            <w:proofErr w:type="gramEnd"/>
+              <w:t xml:space="preserve"> </w:t>
+            </w:r>
             <w:r>
               <w:rPr>
                 <w:rFonts w:cstheme="minorHAnsi"/>
@@ -17800,83 +17441,7 @@
                 <w:szCs w:val="20"/>
                 <w:lang w:eastAsia="cs-CZ"/>
               </w:rPr>
-              <w:t xml:space="preserve"> + </w:t>
-            </w:r>
-            <w:r>
-              <w:rPr>
-                <w:rFonts w:cstheme="minorHAnsi"/>
-                <w:bCs/>
-                <w:szCs w:val="20"/>
-                <w:lang w:eastAsia="cs-CZ"/>
-              </w:rPr>
-              <w:t>{{section4_worker_</w:t>
-            </w:r>
-            <w:proofErr w:type="gramStart"/>
-            <w:r>
-              <w:rPr>
-                <w:rFonts w:cstheme="minorHAnsi"/>
-                <w:bCs/>
-                <w:szCs w:val="20"/>
-                <w:lang w:eastAsia="cs-CZ"/>
-              </w:rPr>
-              <w:t>a.safety</w:t>
-            </w:r>
-            <w:proofErr w:type="gramEnd"/>
-            <w:r>
-              <w:rPr>
-                <w:rFonts w:cstheme="minorHAnsi"/>
-                <w:bCs/>
-                <w:szCs w:val="20"/>
-                <w:lang w:eastAsia="cs-CZ"/>
-              </w:rPr>
-              <w:t>_break_min|czech</w:t>
-            </w:r>
-            <w:proofErr w:type="gramStart"/>
-            <w:r>
-              <w:rPr>
-                <w:rFonts w:cstheme="minorHAnsi"/>
-                <w:bCs/>
-                <w:szCs w:val="20"/>
-                <w:lang w:eastAsia="cs-CZ"/>
-              </w:rPr>
-              <w:t>}}</w:t>
-            </w:r>
-            <w:r>
-              <w:rPr>
-                <w:rFonts w:cstheme="minorHAnsi"/>
-                <w:b/>
-                <w:szCs w:val="20"/>
-                <w:lang w:eastAsia="cs-CZ"/>
-              </w:rPr>
-              <w:t xml:space="preserve"> </w:t>
-            </w:r>
-            <w:r>
-              <w:rPr>
-                <w:rFonts w:cstheme="minorHAnsi"/>
-                <w:bCs/>
-                <w:szCs w:val="20"/>
-                <w:lang w:eastAsia="cs-CZ"/>
-              </w:rPr>
-              <w:t xml:space="preserve"> </w:t>
-            </w:r>
-            <w:r>
-              <w:rPr>
-                <w:rFonts w:cstheme="minorHAnsi"/>
-                <w:bCs/>
-                <w:szCs w:val="20"/>
-                <w:lang w:eastAsia="cs-CZ"/>
-              </w:rPr>
-              <w:t xml:space="preserve"> </w:t>
-            </w:r>
-            <w:proofErr w:type="gramEnd"/>
-            <w:r>
-              <w:rPr>
-                <w:rFonts w:cstheme="minorHAnsi"/>
-                <w:bCs/>
-                <w:szCs w:val="20"/>
-                <w:lang w:eastAsia="cs-CZ"/>
-              </w:rPr>
-              <w:t>min bezpečnostní přestávka (BP)</w:t>
+              <w:t xml:space="preserve"> min bezpečnostní přestávka (BP)</w:t>
             </w:r>
           </w:p>
         </w:tc>
@@ -18064,33 +17629,15 @@
           <w:szCs w:val="20"/>
           <w:lang w:eastAsia="cs-CZ"/>
         </w:rPr>
-        <w:t>section_generated_</w:t>
-      </w:r>
-      <w:proofErr w:type="gramStart"/>
+        <w:t>section_generated_texts</w:t>
+      </w:r>
       <w:r>
         <w:rPr>
           <w:color w:val="000000"/>
           <w:szCs w:val="20"/>
           <w:lang w:eastAsia="cs-CZ"/>
         </w:rPr>
-        <w:t>texts</w:t>
-      </w:r>
-      <w:r>
-        <w:rPr>
-          <w:color w:val="000000"/>
-          <w:szCs w:val="20"/>
-          <w:lang w:eastAsia="cs-CZ"/>
-        </w:rPr>
-        <w:t>.prvni</w:t>
-      </w:r>
-      <w:proofErr w:type="gramEnd"/>
-      <w:r>
-        <w:rPr>
-          <w:color w:val="000000"/>
-          <w:szCs w:val="20"/>
-          <w:lang w:eastAsia="cs-CZ"/>
-        </w:rPr>
-        <w:t>_pp_podminka_kategorie</w:t>
+        <w:t>.prvni_pp_podminka_kategorie</w:t>
       </w:r>
       <w:proofErr w:type="spellEnd"/>
       <w:r>
@@ -18126,9 +17673,8 @@
           <w:szCs w:val="20"/>
           <w:lang w:eastAsia="cs-CZ"/>
         </w:rPr>
-        <w:t>{{section2_</w:t>
-      </w:r>
-      <w:proofErr w:type="gramStart"/>
+        <w:t>{{section2_firma.profession_name}}</w:t>
+      </w:r>
       <w:r>
         <w:rPr>
           <w:i/>
@@ -18136,9 +17682,8 @@
           <w:szCs w:val="20"/>
           <w:lang w:eastAsia="cs-CZ"/>
         </w:rPr>
-        <w:t>firma.profession</w:t>
-      </w:r>
-      <w:proofErr w:type="gramEnd"/>
+        <w:t xml:space="preserve"> </w:t>
+      </w:r>
       <w:r>
         <w:rPr>
           <w:i/>
@@ -18146,7 +17691,7 @@
           <w:szCs w:val="20"/>
           <w:lang w:eastAsia="cs-CZ"/>
         </w:rPr>
-        <w:t>_name}}</w:t>
+        <w:t>–</w:t>
       </w:r>
       <w:r>
         <w:rPr>
@@ -18164,7 +17709,7 @@
           <w:szCs w:val="20"/>
           <w:lang w:eastAsia="cs-CZ"/>
         </w:rPr>
-        <w:t>–</w:t>
+        <w:t>ženy</w:t>
       </w:r>
       <w:r>
         <w:rPr>
@@ -18177,24 +17722,6 @@
       </w:r>
       <w:r>
         <w:rPr>
-          <w:i/>
-          <w:color w:val="000000"/>
-          <w:szCs w:val="20"/>
-          <w:lang w:eastAsia="cs-CZ"/>
-        </w:rPr>
-        <w:t>ženy</w:t>
-      </w:r>
-      <w:r>
-        <w:rPr>
-          <w:i/>
-          <w:color w:val="000000"/>
-          <w:szCs w:val="20"/>
-          <w:lang w:eastAsia="cs-CZ"/>
-        </w:rPr>
-        <w:t xml:space="preserve"> </w:t>
-      </w:r>
-      <w:r>
-        <w:rPr>
           <w:color w:val="000000"/>
           <w:szCs w:val="20"/>
           <w:lang w:eastAsia="cs-CZ"/>
@@ -18208,9 +17735,8 @@
           <w:szCs w:val="20"/>
           <w:lang w:eastAsia="cs-CZ"/>
         </w:rPr>
-        <w:t>{{section2_</w:t>
-      </w:r>
-      <w:proofErr w:type="gramStart"/>
+        <w:t>{{section2_firma.workplace}}</w:t>
+      </w:r>
       <w:r>
         <w:rPr>
           <w:rFonts w:cs="Calibri"/>
@@ -18218,25 +17744,6 @@
           <w:szCs w:val="20"/>
           <w:lang w:eastAsia="cs-CZ"/>
         </w:rPr>
-        <w:t>firma.workplace</w:t>
-      </w:r>
-      <w:proofErr w:type="gramEnd"/>
-      <w:r>
-        <w:rPr>
-          <w:rFonts w:cs="Calibri"/>
-          <w:i/>
-          <w:szCs w:val="20"/>
-          <w:lang w:eastAsia="cs-CZ"/>
-        </w:rPr>
-        <w:t>}}</w:t>
-      </w:r>
-      <w:r>
-        <w:rPr>
-          <w:rFonts w:cs="Calibri"/>
-          <w:i/>
-          <w:szCs w:val="20"/>
-          <w:lang w:eastAsia="cs-CZ"/>
-        </w:rPr>
         <w:t xml:space="preserve"> </w:t>
       </w:r>
       <w:r>
@@ -18288,30 +17795,14 @@
           <w:szCs w:val="20"/>
           <w:lang w:eastAsia="cs-CZ"/>
         </w:rPr>
-        <w:t>section_generated_</w:t>
-      </w:r>
-      <w:proofErr w:type="gramStart"/>
+        <w:t>section_generated_texts.</w:t>
+      </w:r>
       <w:r>
         <w:rPr>
           <w:szCs w:val="20"/>
           <w:lang w:eastAsia="cs-CZ"/>
         </w:rPr>
-        <w:t>texts.</w:t>
-      </w:r>
-      <w:r>
-        <w:rPr>
-          <w:szCs w:val="20"/>
-          <w:lang w:eastAsia="cs-CZ"/>
-        </w:rPr>
-        <w:t>pp</w:t>
-      </w:r>
-      <w:proofErr w:type="gramEnd"/>
-      <w:r>
-        <w:rPr>
-          <w:szCs w:val="20"/>
-          <w:lang w:eastAsia="cs-CZ"/>
-        </w:rPr>
-        <w:t>_problematicke_polohy_seznam</w:t>
+        <w:t>pp_problematicke_polohy_seznam</w:t>
       </w:r>
       <w:proofErr w:type="spellEnd"/>
       <w:r>
@@ -18365,63 +17856,36 @@
           <w:szCs w:val="20"/>
           <w:lang w:eastAsia="cs-CZ"/>
         </w:rPr>
-        <w:t>section_generated_</w:t>
-      </w:r>
-      <w:proofErr w:type="gramStart"/>
+        <w:t>section_generated_texts.</w:t>
+      </w:r>
       <w:r>
         <w:rPr>
           <w:b/>
           <w:szCs w:val="20"/>
           <w:lang w:eastAsia="cs-CZ"/>
         </w:rPr>
-        <w:t>texts.</w:t>
-      </w:r>
+        <w:t>pp_kategorie_cislo</w:t>
+      </w:r>
+      <w:proofErr w:type="spellEnd"/>
       <w:r>
         <w:rPr>
           <w:b/>
           <w:szCs w:val="20"/>
           <w:lang w:eastAsia="cs-CZ"/>
         </w:rPr>
-        <w:t>pp</w:t>
-      </w:r>
-      <w:proofErr w:type="gramEnd"/>
-      <w:r>
-        <w:rPr>
-          <w:b/>
+        <w:t>}}</w:t>
+      </w:r>
+      <w:r>
+        <w:rPr>
           <w:szCs w:val="20"/>
           <w:lang w:eastAsia="cs-CZ"/>
         </w:rPr>
-        <w:t>_kategorie_cislo</w:t>
-      </w:r>
-      <w:proofErr w:type="spellEnd"/>
-      <w:r>
-        <w:rPr>
-          <w:b/>
-          <w:szCs w:val="20"/>
-          <w:lang w:eastAsia="cs-CZ"/>
-        </w:rPr>
-        <w:t>}}</w:t>
-      </w:r>
-      <w:r>
-        <w:rPr>
-          <w:szCs w:val="20"/>
-          <w:lang w:eastAsia="cs-CZ"/>
-        </w:rPr>
         <w:t>.</w:t>
       </w:r>
-    </w:p>
-    <w:p>
-      <w:pPr>
-        <w:rPr>
-          <w:sz w:val="24"/>
-          <w:szCs w:val="24"/>
-          <w:lang w:eastAsia="cs-CZ"/>
-        </w:rPr>
-      </w:pPr>
     </w:p>
     <w:tbl>
       <w:tblPr>
-        <w:tblW w:w="9330" w:type="dxa"/>
+        <w:tblW w:w="9200" w:type="dxa"/>
         <w:jc w:val="center"/>
         <w:tblCellMar>
           <w:left w:w="70" w:type="dxa"/>
@@ -18430,9 +17894,9 @@
         <w:tblLook w:val="04A0" w:firstRow="1" w:lastRow="0" w:firstColumn="1" w:lastColumn="0" w:noHBand="0" w:noVBand="1"/>
       </w:tblPr>
       <w:tblGrid>
-        <w:gridCol w:w="3580"/>
-        <w:gridCol w:w="1652"/>
-        <w:gridCol w:w="4098"/>
+        <w:gridCol w:w="711"/>
+        <w:gridCol w:w="879"/>
+        <w:gridCol w:w="7622"/>
       </w:tblGrid>
       <w:tr>
         <w:trPr>
@@ -18441,7 +17905,7 @@
         </w:trPr>
         <w:tc>
           <w:tcPr>
-            <w:tcW w:w="6524" w:type="dxa"/>
+            <w:tcW w:w="6394" w:type="dxa"/>
             <w:tcBorders>
               <w:top w:val="single" w:sz="4" w:space="0" w:color="000000"/>
               <w:left w:val="single" w:sz="4" w:space="0" w:color="auto"/>
@@ -18461,6 +17925,7 @@
                 <w:lang w:eastAsia="cs-CZ"/>
               </w:rPr>
             </w:pPr>
+            <w:bookmarkStart w:id="7" w:name="_Hlk163735604"/>
             <w:r>
               <w:rPr>
                 <w:rFonts w:eastAsia="Times New Roman" w:cs="Calibri"/>
@@ -18468,8 +17933,20 @@
                 <w:szCs w:val="20"/>
                 <w:lang w:eastAsia="cs-CZ"/>
               </w:rPr>
-              <w:t>Výskyt nepřijatelných a podmíněně přijatelných pracovních poloh</w:t>
-            </w:r>
+              <w:t xml:space="preserve">Celosměnový počet pohybů rukou a předloktí s ohledem na vynakládanou průměrnou směnovou časově váženou hodnotu % </w:t>
+            </w:r>
+            <w:proofErr w:type="spellStart"/>
+            <w:r>
+              <w:rPr>
+                <w:rFonts w:eastAsia="Times New Roman" w:cs="Calibri"/>
+                <w:b/>
+                <w:szCs w:val="20"/>
+                <w:lang w:eastAsia="cs-CZ"/>
+              </w:rPr>
+              <w:lastRenderedPageBreak/>
+              <w:t>Fmax</w:t>
+            </w:r>
+            <w:proofErr w:type="spellEnd"/>
           </w:p>
         </w:tc>
         <w:tc>
@@ -18505,6 +17982,7 @@
                 <w:szCs w:val="20"/>
                 <w:lang w:eastAsia="cs-CZ"/>
               </w:rPr>
+              <w:lastRenderedPageBreak/>
               <w:t>Navrhovaná</w:t>
             </w:r>
           </w:p>
@@ -18540,70 +18018,57 @@
               <w:bottom w:val="single" w:sz="4" w:space="0" w:color="auto"/>
               <w:right w:val="single" w:sz="4" w:space="0" w:color="auto"/>
             </w:tcBorders>
-            <w:shd w:val="clear" w:color="auto" w:fill="C00000"/>
-            <w:noWrap/>
-            <w:vAlign w:val="center"/>
-          </w:tcPr>
-          <w:p>
-            <w:pPr>
-              <w:jc w:val="center"/>
-              <w:rPr>
-                <w:rFonts w:ascii="Cambria" w:eastAsia="Times New Roman" w:hAnsi="Cambria" w:cs="Calibri"/>
+            <w:shd w:val="clear" w:color="auto" w:fill="FFC000"/>
+            <w:noWrap/>
+            <w:vAlign w:val="center"/>
+          </w:tcPr>
+          <w:p>
+            <w:pPr>
+              <w:jc w:val="center"/>
+              <w:rPr>
+                <w:rFonts w:asciiTheme="majorHAnsi" w:eastAsia="Times New Roman" w:hAnsiTheme="majorHAnsi" w:cs="Calibri"/>
                 <w:b/>
                 <w:color w:val="FFFFFF"/>
                 <w:sz w:val="72"/>
-                <w:lang w:eastAsia="cs-CZ"/>
-              </w:rPr>
-            </w:pPr>
-            <w:r>
-              <w:rPr>
-                <w:b/>
-                <w:szCs w:val="20"/>
-                <w:lang w:eastAsia="cs-CZ"/>
+                <w:szCs w:val="72"/>
+                <w:lang w:eastAsia="cs-CZ"/>
+              </w:rPr>
+            </w:pPr>
+            <w:r>
+              <w:rPr>
+                <w:rFonts w:asciiTheme="majorHAnsi" w:hAnsiTheme="majorHAnsi"/>
+                <w:b/>
+                <w:sz w:val="72"/>
+                <w:szCs w:val="72"/>
               </w:rPr>
               <w:t>{{</w:t>
             </w:r>
             <w:proofErr w:type="spellStart"/>
             <w:r>
               <w:rPr>
-                <w:b/>
-                <w:szCs w:val="20"/>
-                <w:lang w:eastAsia="cs-CZ"/>
-              </w:rPr>
-              <w:t>section_generated_</w:t>
-            </w:r>
-            <w:proofErr w:type="gramStart"/>
-            <w:r>
-              <w:rPr>
-                <w:b/>
-                <w:szCs w:val="20"/>
-                <w:lang w:eastAsia="cs-CZ"/>
-              </w:rPr>
-              <w:t>texts.</w:t>
-            </w:r>
-            <w:r>
-              <w:rPr>
-                <w:b/>
-                <w:szCs w:val="20"/>
-                <w:lang w:eastAsia="cs-CZ"/>
-              </w:rPr>
-              <w:t>pp</w:t>
-            </w:r>
-            <w:proofErr w:type="gramEnd"/>
-            <w:r>
-              <w:rPr>
-                <w:b/>
-                <w:szCs w:val="20"/>
-                <w:lang w:eastAsia="cs-CZ"/>
-              </w:rPr>
-              <w:t>_kategorie_cislo</w:t>
+                <w:rFonts w:asciiTheme="majorHAnsi" w:hAnsiTheme="majorHAnsi"/>
+                <w:b/>
+                <w:sz w:val="72"/>
+                <w:szCs w:val="72"/>
+              </w:rPr>
+              <w:t>section_generated_texts.</w:t>
+            </w:r>
+            <w:r>
+              <w:rPr>
+                <w:rFonts w:asciiTheme="majorHAnsi" w:hAnsiTheme="majorHAnsi"/>
+                <w:b/>
+                <w:sz w:val="72"/>
+                <w:szCs w:val="72"/>
+              </w:rPr>
+              <w:t>pp_kategorie_cislo</w:t>
             </w:r>
             <w:proofErr w:type="spellEnd"/>
             <w:r>
               <w:rPr>
-                <w:b/>
-                <w:szCs w:val="20"/>
-                <w:lang w:eastAsia="cs-CZ"/>
+                <w:rFonts w:asciiTheme="majorHAnsi" w:hAnsiTheme="majorHAnsi"/>
+                <w:b/>
+                <w:sz w:val="72"/>
+                <w:szCs w:val="72"/>
               </w:rPr>
               <w:t>}}</w:t>
             </w:r>
@@ -18617,7 +18082,7 @@
         </w:trPr>
         <w:tc>
           <w:tcPr>
-            <w:tcW w:w="6524" w:type="dxa"/>
+            <w:tcW w:w="6394" w:type="dxa"/>
             <w:tcBorders>
               <w:top w:val="single" w:sz="4" w:space="0" w:color="auto"/>
               <w:left w:val="single" w:sz="4" w:space="0" w:color="auto"/>
@@ -18643,7 +18108,25 @@
                 <w:szCs w:val="20"/>
                 <w:lang w:eastAsia="cs-CZ"/>
               </w:rPr>
-              <w:t>Hodnocení bylo provedeno dle § 27 NV č. 361/2007 Sb., v platném znění</w:t>
+              <w:t>H</w:t>
+            </w:r>
+            <w:r>
+              <w:rPr>
+                <w:rFonts w:eastAsia="Times New Roman" w:cs="Calibri"/>
+                <w:b/>
+                <w:szCs w:val="20"/>
+                <w:lang w:eastAsia="cs-CZ"/>
+              </w:rPr>
+              <w:t>odnocení bylo provedeno dle § 25</w:t>
+            </w:r>
+            <w:r>
+              <w:rPr>
+                <w:rFonts w:eastAsia="Times New Roman" w:cs="Calibri"/>
+                <w:b/>
+                <w:szCs w:val="20"/>
+                <w:lang w:eastAsia="cs-CZ"/>
+              </w:rPr>
+              <w:t xml:space="preserve"> NV č. 361/2007 Sb., v platném znění</w:t>
             </w:r>
           </w:p>
         </w:tc>
@@ -18681,7 +18164,7 @@
               <w:bottom w:val="single" w:sz="4" w:space="0" w:color="auto"/>
               <w:right w:val="single" w:sz="4" w:space="0" w:color="auto"/>
             </w:tcBorders>
-            <w:shd w:val="clear" w:color="auto" w:fill="C00000"/>
+            <w:shd w:val="clear" w:color="auto" w:fill="FFC000"/>
             <w:noWrap/>
           </w:tcPr>
           <w:p>
@@ -18695,15 +18178,8 @@
           </w:p>
         </w:tc>
       </w:tr>
+      <w:bookmarkEnd w:id="7"/>
     </w:tbl>
-    <w:p>
-      <w:pPr>
-        <w:spacing w:after="200" w:line="276" w:lineRule="auto"/>
-        <w:rPr>
-          <w:lang w:eastAsia="cs-CZ"/>
-        </w:rPr>
-      </w:pPr>
-    </w:p>
     <w:p>
       <w:pPr>
         <w:spacing w:after="200" w:line="276" w:lineRule="auto"/>
@@ -19789,7 +19265,7 @@
           <w:lang w:eastAsia="cs-CZ"/>
         </w:rPr>
       </w:pPr>
-      <w:bookmarkStart w:id="7" w:name="_Hlk167272628"/>
+      <w:bookmarkStart w:id="8" w:name="_Hlk167272628"/>
       <w:r>
         <w:rPr>
           <w:lang w:eastAsia="cs-CZ"/>
@@ -19806,27 +19282,13 @@
         <w:rPr>
           <w:lang w:eastAsia="cs-CZ"/>
         </w:rPr>
-        <w:t>section6_</w:t>
-      </w:r>
-      <w:proofErr w:type="gramStart"/>
-      <w:r>
-        <w:rPr>
-          <w:lang w:eastAsia="cs-CZ"/>
-        </w:rPr>
-        <w:t>final</w:t>
-      </w:r>
-      <w:r>
-        <w:rPr>
-          <w:lang w:eastAsia="cs-CZ"/>
-        </w:rPr>
-        <w:t>.measured</w:t>
-      </w:r>
-      <w:proofErr w:type="gramEnd"/>
-      <w:r>
-        <w:rPr>
-          <w:lang w:eastAsia="cs-CZ"/>
-        </w:rPr>
-        <w:t>_by}}</w:t>
+        <w:t>section6_final</w:t>
+      </w:r>
+      <w:r>
+        <w:rPr>
+          <w:lang w:eastAsia="cs-CZ"/>
+        </w:rPr>
+        <w:t>.measured_by}}</w:t>
       </w:r>
     </w:p>
     <w:p>
@@ -20015,7 +19477,7 @@
         </w:drawing>
       </w:r>
     </w:p>
-    <w:bookmarkEnd w:id="7"/>
+    <w:bookmarkEnd w:id="8"/>
     <w:tbl>
       <w:tblPr>
         <w:tblStyle w:val="Mkatabulky"/>
@@ -20209,55 +19671,7 @@
               <w:szCs w:val="18"/>
               <w:lang w:eastAsia="cs-CZ"/>
             </w:rPr>
-            <w:t>{{section2_</w:t>
-          </w:r>
-          <w:proofErr w:type="gramStart"/>
-          <w:r>
-            <w:rPr>
-              <w:rFonts w:eastAsia="Times New Roman" w:cs="Calibri"/>
-              <w:b/>
-              <w:bCs/>
-              <w:sz w:val="18"/>
-              <w:szCs w:val="18"/>
-              <w:lang w:eastAsia="cs-CZ"/>
-            </w:rPr>
-            <w:t>firma.evidence</w:t>
-          </w:r>
-          <w:proofErr w:type="gramEnd"/>
-          <w:r>
-            <w:rPr>
-              <w:rFonts w:eastAsia="Times New Roman" w:cs="Calibri"/>
-              <w:b/>
-              <w:bCs/>
-              <w:sz w:val="18"/>
-              <w:szCs w:val="18"/>
-              <w:lang w:eastAsia="cs-CZ"/>
-            </w:rPr>
-            <w:t>_number</w:t>
-          </w:r>
-          <w:proofErr w:type="gramStart"/>
-          <w:r>
-            <w:rPr>
-              <w:rFonts w:eastAsia="Times New Roman" w:cs="Calibri"/>
-              <w:b/>
-              <w:bCs/>
-              <w:sz w:val="18"/>
-              <w:szCs w:val="18"/>
-              <w:lang w:eastAsia="cs-CZ"/>
-            </w:rPr>
-            <w:t>}}/</w:t>
-          </w:r>
-          <w:proofErr w:type="gramEnd"/>
-          <w:r>
-            <w:rPr>
-              <w:rFonts w:eastAsia="Times New Roman" w:cs="Calibri"/>
-              <w:b/>
-              <w:bCs/>
-              <w:sz w:val="18"/>
-              <w:szCs w:val="18"/>
-              <w:lang w:eastAsia="cs-CZ"/>
-            </w:rPr>
-            <w:t>2025</w:t>
+            <w:t>{{section2_firma.evidence_number}}/2025</w:t>
           </w:r>
         </w:p>
       </w:tc>
@@ -20584,55 +19998,7 @@
               <w:szCs w:val="18"/>
               <w:lang w:eastAsia="cs-CZ"/>
             </w:rPr>
-            <w:t>{{section2_</w:t>
-          </w:r>
-          <w:proofErr w:type="gramStart"/>
-          <w:r>
-            <w:rPr>
-              <w:rFonts w:eastAsia="Times New Roman" w:cs="Calibri"/>
-              <w:b/>
-              <w:bCs/>
-              <w:sz w:val="18"/>
-              <w:szCs w:val="18"/>
-              <w:lang w:eastAsia="cs-CZ"/>
-            </w:rPr>
-            <w:t>firma.evidence</w:t>
-          </w:r>
-          <w:proofErr w:type="gramEnd"/>
-          <w:r>
-            <w:rPr>
-              <w:rFonts w:eastAsia="Times New Roman" w:cs="Calibri"/>
-              <w:b/>
-              <w:bCs/>
-              <w:sz w:val="18"/>
-              <w:szCs w:val="18"/>
-              <w:lang w:eastAsia="cs-CZ"/>
-            </w:rPr>
-            <w:t>_number</w:t>
-          </w:r>
-          <w:proofErr w:type="gramStart"/>
-          <w:r>
-            <w:rPr>
-              <w:rFonts w:eastAsia="Times New Roman" w:cs="Calibri"/>
-              <w:b/>
-              <w:bCs/>
-              <w:sz w:val="18"/>
-              <w:szCs w:val="18"/>
-              <w:lang w:eastAsia="cs-CZ"/>
-            </w:rPr>
-            <w:t>}}/</w:t>
-          </w:r>
-          <w:proofErr w:type="gramEnd"/>
-          <w:r>
-            <w:rPr>
-              <w:rFonts w:eastAsia="Times New Roman" w:cs="Calibri"/>
-              <w:b/>
-              <w:bCs/>
-              <w:sz w:val="18"/>
-              <w:szCs w:val="18"/>
-              <w:lang w:eastAsia="cs-CZ"/>
-            </w:rPr>
-            <w:t>2025</w:t>
+            <w:t>{{section2_firma.evidence_number}}/2025</w:t>
           </w:r>
         </w:p>
       </w:tc>
@@ -21112,7 +20478,7 @@
         </mc:Choice>
         <mc:Fallback>
           <w:pict>
-            <v:line w14:anchorId="5C646F07" id="Přímá spojnice 4" o:spid="_x0000_s1026" style="position:absolute;z-index:251658240;visibility:visible;mso-wrap-style:square;mso-width-percent:0;mso-height-percent:0;mso-wrap-distance-left:9pt;mso-wrap-distance-top:-1e-4mm;mso-wrap-distance-right:9pt;mso-wrap-distance-bottom:-1e-4mm;mso-position-horizontal:absolute;mso-position-horizontal-relative:text;mso-position-vertical:absolute;mso-position-vertical-relative:text;mso-width-percent:0;mso-height-percent:0;mso-width-relative:margin;mso-height-relative:margin" from="-34.1pt,19.8pt" to="490.15pt,19.8pt" o:gfxdata="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">
+            <v:line w14:anchorId="491AD9BD" id="Přímá spojnice 4" o:spid="_x0000_s1026" style="position:absolute;z-index:251658240;visibility:visible;mso-wrap-style:square;mso-width-percent:0;mso-height-percent:0;mso-wrap-distance-left:9pt;mso-wrap-distance-top:-1e-4mm;mso-wrap-distance-right:9pt;mso-wrap-distance-bottom:-1e-4mm;mso-position-horizontal:absolute;mso-position-horizontal-relative:text;mso-position-vertical:absolute;mso-position-vertical-relative:text;mso-width-percent:0;mso-height-percent:0;mso-width-relative:margin;mso-height-relative:margin" from="-34.1pt,19.8pt" to="490.15pt,19.8pt" o:gfxdata="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">
               <o:lock v:ext="edit" shapetype="f"/>
             </v:line>
           </w:pict>

</xml_diff>